<commit_message>
Update Supplementary_Methods.docx with CAGE gene-level & Dataset covariate limitation discussion
</commit_message>
<xml_diff>
--- a/Supplementary_Methods.docx
+++ b/Supplementary_Methods.docx
@@ -2,13 +2,13 @@
 <file path=word/document.xml><?xml version="1.0" encoding="utf-8"?>
 <w:document xmlns:w="http://schemas.openxmlformats.org/wordprocessingml/2006/main" xmlns:m="http://schemas.openxmlformats.org/officeDocument/2006/math" xmlns:r="http://schemas.openxmlformats.org/officeDocument/2006/relationships" xmlns:o="urn:schemas-microsoft-com:office:office" xmlns:v="urn:schemas-microsoft-com:vml" xmlns:w10="urn:schemas-microsoft-com:office:word" xmlns:a="http://schemas.openxmlformats.org/drawingml/2006/main" xmlns:pic="http://schemas.openxmlformats.org/drawingml/2006/picture" xmlns:wp="http://schemas.openxmlformats.org/drawingml/2006/wordprocessingDrawing">
   <w:body>
-    <w:bookmarkStart w:id="49" w:name="supplementary-materials"/>
+    <w:bookmarkStart w:id="50" w:name="supplementary-methods"/>
     <w:p>
       <w:pPr>
         <w:pStyle w:val="Heading1"/>
       </w:pPr>
       <w:r>
-        <w:t xml:space="preserve">Supplementary Materials</w:t>
+        <w:t xml:space="preserve">Supplementary Methods</w:t>
       </w:r>
     </w:p>
     <w:bookmarkStart w:id="9" w:name="X07e61affdddc16d8a3fa615807d49d662fcf84c"/>
@@ -5946,16 +5946,156 @@
     </w:p>
     <w:bookmarkEnd w:id="45"/>
     <w:bookmarkEnd w:id="46"/>
-    <w:bookmarkStart w:id="48" w:name="supplementary-methods"/>
+    <w:bookmarkStart w:id="47" w:name="methodological-trade-offs-limitations"/>
     <w:p>
       <w:pPr>
         <w:pStyle w:val="Heading2"/>
       </w:pPr>
       <w:r>
+        <w:t xml:space="preserve">Methodological Trade-offs &amp; Limitations</w:t>
+      </w:r>
+    </w:p>
+    <w:p>
+      <w:pPr>
+        <w:pStyle w:val="FirstParagraph"/>
+      </w:pPr>
+      <w:r>
+        <w:t xml:space="preserve">Integrating CAGE-seq datasets across FANTOM5 (HeliScope, 2014) and FANTOM6 (Lenti-CAGE, 2022) introduces two primary analytical trade-offs:</w:t>
+      </w:r>
+    </w:p>
+    <w:p>
+      <w:pPr>
+        <w:numPr>
+          <w:ilvl w:val="0"/>
+          <w:numId w:val="1001"/>
+        </w:numPr>
+      </w:pPr>
+      <w:r>
+        <w:rPr>
+          <w:b/>
+          <w:bCs/>
+        </w:rPr>
+        <w:t xml:space="preserve">Gene-Level vs. Promoter-Level Isoform Resolution</w:t>
+      </w:r>
+      <w:r>
+        <w:t xml:space="preserve">:</w:t>
+      </w:r>
+      <w:r>
+        <w:t xml:space="preserve"> </w:t>
+      </w:r>
+      <w:r>
+        <w:t xml:space="preserve">CAGE measures transcription start sites at promoter resolution. Because promoter peak definitions differed between FANTOM5 (hg19 remapped) and FANTOM6 (CAT promoter annotation), cross-platform integration required summing counts to gene-level HGNC symbols. Consequently, Differential Transcript Usage (DTU) or alternative promoter switching between tissues cannot be detected in the integrated dataset.</w:t>
+      </w:r>
+    </w:p>
+    <w:p>
+      <w:pPr>
+        <w:numPr>
+          <w:ilvl w:val="0"/>
+          <w:numId w:val="1001"/>
+        </w:numPr>
+      </w:pPr>
+      <w:r>
+        <w:rPr>
+          <w:b/>
+          <w:bCs/>
+        </w:rPr>
+        <w:t xml:space="preserve">The Dataset Covariate Trade-Off (False Positives vs. False Negatives)</w:t>
+      </w:r>
+      <w:r>
+        <w:t xml:space="preserve">:</w:t>
+      </w:r>
+      <w:r>
+        <w:t xml:space="preserve"> </w:t>
+      </w:r>
+      <w:r>
+        <w:t xml:space="preserve">Because Foreskin samples exist exclusively in FANTOM6, while Breast samples exist in both FANTOM5 and FANTOM6, including</w:t>
+      </w:r>
+      <w:r>
+        <w:t xml:space="preserve"> </w:t>
+      </w:r>
+      <w:r>
+        <w:rPr>
+          <w:rStyle w:val="VerbatimChar"/>
+        </w:rPr>
+        <w:t xml:space="preserve">Dataset</w:t>
+      </w:r>
+      <w:r>
+        <w:t xml:space="preserve"> </w:t>
+      </w:r>
+      <w:r>
+        <w:t xml:space="preserve">as a fixed term (</w:t>
+      </w:r>
+      <w:r>
+        <w:rPr>
+          <w:rStyle w:val="VerbatimChar"/>
+        </w:rPr>
+        <w:t xml:space="preserve">~ Tissue + State + Dataset</w:t>
+      </w:r>
+      <w:r>
+        <w:t xml:space="preserve">) absorbs platform batch variance. Omitting</w:t>
+      </w:r>
+      <w:r>
+        <w:t xml:space="preserve"> </w:t>
+      </w:r>
+      <w:r>
+        <w:rPr>
+          <w:rStyle w:val="VerbatimChar"/>
+        </w:rPr>
+        <w:t xml:space="preserve">Dataset</w:t>
+      </w:r>
+      <w:r>
+        <w:t xml:space="preserve"> </w:t>
+      </w:r>
+      <w:r>
+        <w:t xml:space="preserve">generates 1,839 false positives driven by technology differences. However, including</w:t>
+      </w:r>
+      <w:r>
+        <w:t xml:space="preserve"> </w:t>
+      </w:r>
+      <w:r>
+        <w:rPr>
+          <w:rStyle w:val="VerbatimChar"/>
+        </w:rPr>
+        <w:t xml:space="preserve">Dataset</w:t>
+      </w:r>
+      <w:r>
+        <w:t xml:space="preserve"> </w:t>
+      </w:r>
+      <w:r>
+        <w:t xml:space="preserve">as a covariate means that some genuine biological variance associated with tissue origin is absorbed by the platform term, creating a conservative risk of</w:t>
+      </w:r>
+      <w:r>
+        <w:t xml:space="preserve"> </w:t>
+      </w:r>
+      <w:r>
+        <w:rPr>
+          <w:b/>
+          <w:bCs/>
+        </w:rPr>
+        <w:t xml:space="preserve">False Negatives</w:t>
+      </w:r>
+      <w:r>
+        <w:t xml:space="preserve">. Thus, the 11 tissue DE genes represent a highly conservative, high-confidence set.</w:t>
+      </w:r>
+    </w:p>
+    <w:p>
+      <w:r>
+        <w:pict>
+          <v:rect style="width:0;height:1.5pt" o:hralign="center" o:hrstd="t" o:hr="t"/>
+        </w:pict>
+      </w:r>
+    </w:p>
+    <w:bookmarkEnd w:id="47"/>
+    <w:bookmarkStart w:id="49" w:name="supplementary-methods-1"/>
+    <w:p>
+      <w:pPr>
+        <w:pStyle w:val="Heading2"/>
+      </w:pPr>
+      <w:r>
         <w:t xml:space="preserve">Supplementary Methods</w:t>
       </w:r>
     </w:p>
-    <w:bookmarkStart w:id="47" w:name="X71fab695720871d29b03835205d29a1b7b73978"/>
+    <w:bookmarkStart w:id="48" w:name="X71fab695720871d29b03835205d29a1b7b73978"/>
     <w:p>
       <w:pPr>
         <w:pStyle w:val="Heading3"/>
@@ -5969,7 +6109,7 @@
         <w:pStyle w:val="Compact"/>
         <w:numPr>
           <w:ilvl w:val="0"/>
-          <w:numId w:val="1001"/>
+          <w:numId w:val="1002"/>
         </w:numPr>
       </w:pPr>
       <w:r>
@@ -5988,7 +6128,7 @@
         <w:pStyle w:val="Compact"/>
         <w:numPr>
           <w:ilvl w:val="0"/>
-          <w:numId w:val="1001"/>
+          <w:numId w:val="1002"/>
         </w:numPr>
       </w:pPr>
       <w:r>
@@ -6040,7 +6180,7 @@
         <w:pStyle w:val="Compact"/>
         <w:numPr>
           <w:ilvl w:val="0"/>
-          <w:numId w:val="1001"/>
+          <w:numId w:val="1002"/>
         </w:numPr>
       </w:pPr>
       <w:r>
@@ -6084,9 +6224,9 @@
         <w:t xml:space="preserve">to estimate intra-donor consensus correlation (r = 0.433).</w:t>
       </w:r>
     </w:p>
-    <w:bookmarkEnd w:id="47"/>
     <w:bookmarkEnd w:id="48"/>
     <w:bookmarkEnd w:id="49"/>
+    <w:bookmarkEnd w:id="50"/>
     <w:sectPr>
       <w:footnotePr>
         <w:numRestart w:val="eachSect"/>
@@ -6286,6 +6426,36 @@
     <w:abstractNumId w:val="990"/>
   </w:num>
   <w:num w:numId="1001">
+    <w:abstractNumId w:val="99411"/>
+    <w:lvlOverride w:ilvl="0">
+      <w:startOverride w:val="1"/>
+    </w:lvlOverride>
+    <w:lvlOverride w:ilvl="1">
+      <w:startOverride w:val="1"/>
+    </w:lvlOverride>
+    <w:lvlOverride w:ilvl="2">
+      <w:startOverride w:val="1"/>
+    </w:lvlOverride>
+    <w:lvlOverride w:ilvl="3">
+      <w:startOverride w:val="1"/>
+    </w:lvlOverride>
+    <w:lvlOverride w:ilvl="4">
+      <w:startOverride w:val="1"/>
+    </w:lvlOverride>
+    <w:lvlOverride w:ilvl="5">
+      <w:startOverride w:val="1"/>
+    </w:lvlOverride>
+    <w:lvlOverride w:ilvl="6">
+      <w:startOverride w:val="1"/>
+    </w:lvlOverride>
+    <w:lvlOverride w:ilvl="7">
+      <w:startOverride w:val="1"/>
+    </w:lvlOverride>
+    <w:lvlOverride w:ilvl="8">
+      <w:startOverride w:val="1"/>
+    </w:lvlOverride>
+  </w:num>
+  <w:num w:numId="1002">
     <w:abstractNumId w:val="99411"/>
     <w:lvlOverride w:ilvl="0">
       <w:startOverride w:val="1"/>

</xml_diff>